<commit_message>
update s2b-s2e and qtt
</commit_message>
<xml_diff>
--- a/src/TaxMate.Infrastructure/Templates/Tax/2026/mau-s2b-hkd.docx
+++ b/src/TaxMate.Infrastructure/Templates/Tax/2026/mau-s2b-hkd.docx
@@ -15061,200 +15061,4 @@
     </a:ext>
   </a:extLst>
 </a:theme>
-</file>
-
-<file path=_xmlsignatures/sig1.xml><?xml version="1.0" encoding="utf-8"?>
-<Signature xmlns="http://www.w3.org/2000/09/xmldsig#" Id="idPackageSignature">
-  <SignedInfo>
-    <CanonicalizationMethod Algorithm="http://www.w3.org/TR/2001/REC-xml-c14n-20010315"/>
-    <SignatureMethod Algorithm="http://www.w3.org/2001/04/xmldsig-more#rsa-sha256"/>
-    <Reference Type="http://www.w3.org/2000/09/xmldsig#Object" URI="#idPackageObject">
-      <DigestMethod Algorithm="http://www.w3.org/2001/04/xmlenc#sha256"/>
-      <DigestValue>wpoiqI4yoTErBsPJUWp6eigXaVjP4Lw1MjiUi81M9tM=</DigestValue>
-    </Reference>
-    <Reference Type="http://www.w3.org/2000/09/xmldsig#Object" URI="#idOfficeObject">
-      <DigestMethod Algorithm="http://www.w3.org/2001/04/xmlenc#sha256"/>
-      <DigestValue>+knhtkniEhS0IyqnHYBzM5NTkzyRW9p4EKnIfwFBfOU=</DigestValue>
-    </Reference>
-    <Reference Type="http://uri.etsi.org/01903#SignedProperties" URI="#idSignedProperties">
-      <Transforms>
-        <Transform Algorithm="http://www.w3.org/TR/2001/REC-xml-c14n-20010315"/>
-      </Transforms>
-      <DigestMethod Algorithm="http://www.w3.org/2001/04/xmlenc#sha256"/>
-      <DigestValue>rYTjE20jJkjvKyyPdzsOqHjCBD/W8Svtq9GMc2ek1fM=</DigestValue>
-    </Reference>
-  </SignedInfo>
-  <SignatureValue>J7c5CzwxZIcAwLOIm0OD4YA2DZlLJjp0uyf+c04Kg821pyBcqpB3bfhvgWIScF/Un52VKBM2d9AJ
-qTYmRS/7tTl7bp/B6OmIy0LhyHCTk4l9fhLTAPmcL9AllNs3HbqqfrbwWxd3+ltExW+pL2YRFGHy
-/hcjw8DDvSjO/zJPsRIwlQH72mgFNPt0i4OAhg0/RWBT0SU1xhvrEylhcyc49N3QirbPxriZv/jZ
-Hi0e7WpoQkWqrgSOrv9W6/qQ6hFHuqSX8MCbs244Q9C2NdhYqGAe4bJYooFMR3PIjA7QJPQhAKR9
-GG8jq8Z/ll8YR4kZoHuqIkfXyaOpa39odGNmxLOnKu/GrzM1LoKH/FVdDeP2AT+ea9i5A2sVLKok
-OI+tHQWbQurqqSs7xvi+oh1X4o1LebZmTkLJgdB/DcVMqJMVF4La9rCUTQFhbOiUvTp/vFUOeiZj
-EJhAvW9EhwPK+kGaOxrsnzifSY8OWW2yPQ/wvbro0pq2H1g6I5LzBLUn</SignatureValue>
-  <KeyInfo>
-    <X509Data>
-      <X509Certificate>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</X509Certificate>
-    </X509Data>
-  </KeyInfo>
-  <Object Id="idPackageObject">
-    <Manifest>
-      <Reference URI="/_rels/.rels?ContentType=application/vnd.openxmlformats-package.relationships+xml">
-        <Transforms>
-          <Transform Algorithm="http://schemas.openxmlformats.org/package/2006/RelationshipTransform">
-            <mdssi:RelationshipReference xmlns:mdssi="http://schemas.openxmlformats.org/package/2006/digital-signature" SourceId="rId1"/>
-          </Transform>
-          <Transform Algorithm="http://www.w3.org/TR/2001/REC-xml-c14n-20010315"/>
-        </Transforms>
-        <DigestMethod Algorithm="http://www.w3.org/2001/04/xmlenc#sha256"/>
-        <DigestValue>Mq3mDDWudLiaQFa1psBgLG+/en7p7r8re0MtlxnuiUI=</DigestValue>
-      </Reference>
-      <Reference URI="/word/_rels/document.xml.rels?ContentType=application/vnd.openxmlformats-package.relationships+xml">
-        <Transforms>
-          <Transform Algorithm="http://schemas.openxmlformats.org/package/2006/RelationshipTransform">
-            <mdssi:RelationshipReference xmlns:mdssi="http://schemas.openxmlformats.org/package/2006/digital-signature" SourceId="rId14"/>
-            <mdssi:RelationshipReference xmlns:mdssi="http://schemas.openxmlformats.org/package/2006/digital-signature" SourceId="rId8"/>
-            <mdssi:RelationshipReference xmlns:mdssi="http://schemas.openxmlformats.org/package/2006/digital-signature" SourceId="rId13"/>
-            <mdssi:RelationshipReference xmlns:mdssi="http://schemas.openxmlformats.org/package/2006/digital-signature" SourceId="rId3"/>
-            <mdssi:RelationshipReference xmlns:mdssi="http://schemas.openxmlformats.org/package/2006/digital-signature" SourceId="rId7"/>
-            <mdssi:RelationshipReference xmlns:mdssi="http://schemas.openxmlformats.org/package/2006/digital-signature" SourceId="rId12"/>
-            <mdssi:RelationshipReference xmlns:mdssi="http://schemas.openxmlformats.org/package/2006/digital-signature" SourceId="rId2"/>
-            <mdssi:RelationshipReference xmlns:mdssi="http://schemas.openxmlformats.org/package/2006/digital-signature" SourceId="rId1"/>
-            <mdssi:RelationshipReference xmlns:mdssi="http://schemas.openxmlformats.org/package/2006/digital-signature" SourceId="rId6"/>
-            <mdssi:RelationshipReference xmlns:mdssi="http://schemas.openxmlformats.org/package/2006/digital-signature" SourceId="rId11"/>
-            <mdssi:RelationshipReference xmlns:mdssi="http://schemas.openxmlformats.org/package/2006/digital-signature" SourceId="rId5"/>
-            <mdssi:RelationshipReference xmlns:mdssi="http://schemas.openxmlformats.org/package/2006/digital-signature" SourceId="rId10"/>
-            <mdssi:RelationshipReference xmlns:mdssi="http://schemas.openxmlformats.org/package/2006/digital-signature" SourceId="rId4"/>
-            <mdssi:RelationshipReference xmlns:mdssi="http://schemas.openxmlformats.org/package/2006/digital-signature" SourceId="rId9"/>
-          </Transform>
-          <Transform Algorithm="http://www.w3.org/TR/2001/REC-xml-c14n-20010315"/>
-        </Transforms>
-        <DigestMethod Algorithm="http://www.w3.org/2001/04/xmlenc#sha256"/>
-        <DigestValue>dtQE+1I2pmf5G2tPLtKIIKOmTrJRuTtNLHD0gpDb4fc=</DigestValue>
-      </Reference>
-      <Reference URI="/word/document.xml?ContentType=application/vnd.openxmlformats-officedocument.wordprocessingml.document.main+xml">
-        <DigestMethod Algorithm="http://www.w3.org/2001/04/xmlenc#sha256"/>
-        <DigestValue>G1ollIaW6y9SYgpnyMQYcYVLYugajTqxgFJB4nRlijw=</DigestValue>
-      </Reference>
-      <Reference URI="/word/endnotes.xml?ContentType=application/vnd.openxmlformats-officedocument.wordprocessingml.endnotes+xml">
-        <DigestMethod Algorithm="http://www.w3.org/2001/04/xmlenc#sha256"/>
-        <DigestValue>Oe7xsbNdusGa5iCX7lavzEWm87iV6dvArUu/ptYRzHw=</DigestValue>
-      </Reference>
-      <Reference URI="/word/fontTable.xml?ContentType=application/vnd.openxmlformats-officedocument.wordprocessingml.fontTable+xml">
-        <DigestMethod Algorithm="http://www.w3.org/2001/04/xmlenc#sha256"/>
-        <DigestValue>LnsuikoSdjF4bcZ2mZ8GncZM36zhc9Ylomjlfit7OtU=</DigestValue>
-      </Reference>
-      <Reference URI="/word/footer1.xml?ContentType=application/vnd.openxmlformats-officedocument.wordprocessingml.footer+xml">
-        <DigestMethod Algorithm="http://www.w3.org/2001/04/xmlenc#sha256"/>
-        <DigestValue>Qmn/EIjcslBkLp2uOR6J0fh8tJNARUfLge9xHLf+j74=</DigestValue>
-      </Reference>
-      <Reference URI="/word/footer2.xml?ContentType=application/vnd.openxmlformats-officedocument.wordprocessingml.footer+xml">
-        <DigestMethod Algorithm="http://www.w3.org/2001/04/xmlenc#sha256"/>
-        <DigestValue>Dsf76hmazHvi2YZpjUbIN1tpL2Bmcls6M716XbT/E4w=</DigestValue>
-      </Reference>
-      <Reference URI="/word/footer3.xml?ContentType=application/vnd.openxmlformats-officedocument.wordprocessingml.footer+xml">
-        <DigestMethod Algorithm="http://www.w3.org/2001/04/xmlenc#sha256"/>
-        <DigestValue>iSAvve4qri1d691QdMz+Ffxjt9xna2/8NsiF5wAUD8I=</DigestValue>
-      </Reference>
-      <Reference URI="/word/footnotes.xml?ContentType=application/vnd.openxmlformats-officedocument.wordprocessingml.footnotes+xml">
-        <DigestMethod Algorithm="http://www.w3.org/2001/04/xmlenc#sha256"/>
-        <DigestValue>Zn7wz3uXgJXPjZTXExnvS24JpwsZtYQqeRbcxlZtmrg=</DigestValue>
-      </Reference>
-      <Reference URI="/word/header1.xml?ContentType=application/vnd.openxmlformats-officedocument.wordprocessingml.header+xml">
-        <DigestMethod Algorithm="http://www.w3.org/2001/04/xmlenc#sha256"/>
-        <DigestValue>usCfS6uyYWICXf/+dlmjcQafOd7O4B0chCeTDf9oDws=</DigestValue>
-      </Reference>
-      <Reference URI="/word/header2.xml?ContentType=application/vnd.openxmlformats-officedocument.wordprocessingml.header+xml">
-        <DigestMethod Algorithm="http://www.w3.org/2001/04/xmlenc#sha256"/>
-        <DigestValue>QUAeGXzYlfLCLkQezhD4vIAZhVYiDWk/bbUSGdNImFA=</DigestValue>
-      </Reference>
-      <Reference URI="/word/header3.xml?ContentType=application/vnd.openxmlformats-officedocument.wordprocessingml.header+xml">
-        <DigestMethod Algorithm="http://www.w3.org/2001/04/xmlenc#sha256"/>
-        <DigestValue>yQ5Tr6EZ9N24NLDbMADYysBEiNrIftSkybMc4rEK46Y=</DigestValue>
-      </Reference>
-      <Reference URI="/word/numbering.xml?ContentType=application/vnd.openxmlformats-officedocument.wordprocessingml.numbering+xml">
-        <DigestMethod Algorithm="http://www.w3.org/2001/04/xmlenc#sha256"/>
-        <DigestValue>A2Qnvl48JkPY8bKnnpI88nMcah83H/DAEoKHBLnTPHM=</DigestValue>
-      </Reference>
-      <Reference URI="/word/settings.xml?ContentType=application/vnd.openxmlformats-officedocument.wordprocessingml.settings+xml">
-        <DigestMethod Algorithm="http://www.w3.org/2001/04/xmlenc#sha256"/>
-        <DigestValue>TpIliTwMyyFvkZbvrGu/bFo+f/OZ7biOJ34LQSyQnzg=</DigestValue>
-      </Reference>
-      <Reference URI="/word/styles.xml?ContentType=application/vnd.openxmlformats-officedocument.wordprocessingml.styles+xml">
-        <DigestMethod Algorithm="http://www.w3.org/2001/04/xmlenc#sha256"/>
-        <DigestValue>LEmBCBFjOwWXtkUtjesxIX0PEPTSKqsQMLGOF2YjhaU=</DigestValue>
-      </Reference>
-      <Reference URI="/word/theme/theme1.xml?ContentType=application/vnd.openxmlformats-officedocument.theme+xml">
-        <DigestMethod Algorithm="http://www.w3.org/2001/04/xmlenc#sha256"/>
-        <DigestValue>03Yn7Rpb2kD6M5zCEVxw214BnxsShza5KyZxgFMUNMY=</DigestValue>
-      </Reference>
-      <Reference URI="/word/webSettings.xml?ContentType=application/vnd.openxmlformats-officedocument.wordprocessingml.webSettings+xml">
-        <DigestMethod Algorithm="http://www.w3.org/2001/04/xmlenc#sha256"/>
-        <DigestValue>8vb+dnljSWO/SbrmX5QfQZNN5Czus6gGr6xLq5InSFM=</DigestValue>
-      </Reference>
-    </Manifest>
-    <SignatureProperties>
-      <SignatureProperty Id="idSignatureTime" Target="#idPackageSignature">
-        <mdssi:SignatureTime xmlns:mdssi="http://schemas.openxmlformats.org/package/2006/digital-signature">
-          <mdssi:Format>YYYY-MM-DDThh:mm:ssTZD</mdssi:Format>
-          <mdssi:Value>2026-01-28T04:04:22Z</mdssi:Value>
-        </mdssi:SignatureTime>
-      </SignatureProperty>
-    </SignatureProperties>
-  </Object>
-  <Object Id="idOfficeObject">
-    <SignatureProperties>
-      <SignatureProperty Id="idOfficeV1Details" Target="#idPackageSignature">
-        <SignatureInfoV1 xmlns="http://schemas.microsoft.com/office/2006/digsig">
-          <SetupID/>
-          <SignatureText/>
-          <SignatureImage/>
-          <SignatureComments/>
-          <WindowsVersion>10.0</WindowsVersion>
-          <OfficeVersion>16.0.19127/27</OfficeVersion>
-          <ApplicationVersion>16.0.19127</ApplicationVersion>
-          <Monitors>1</Monitors>
-          <HorizontalResolution>1920</HorizontalResolution>
-          <VerticalResolution>1080</VerticalResolution>
-          <ColorDepth>32</ColorDepth>
-          <SignatureProviderId>{00000000-0000-0000-0000-000000000000}</SignatureProviderId>
-          <SignatureProviderUrl/>
-          <SignatureProviderDetails>9</SignatureProviderDetails>
-          <SignatureType>1</SignatureType>
-        </SignatureInfoV1>
-      </SignatureProperty>
-    </SignatureProperties>
-  </Object>
-  <Object>
-    <xd:QualifyingProperties xmlns:xd="http://uri.etsi.org/01903/v1.3.2#" Target="#idPackageSignature">
-      <xd:SignedProperties Id="idSignedProperties">
-        <xd:SignedSignatureProperties>
-          <xd:SigningTime>2026-01-28T04:04:22Z</xd:SigningTime>
-          <xd:SigningCertificate>
-            <xd:Cert>
-              <xd:CertDigest>
-                <DigestMethod Algorithm="http://www.w3.org/2001/04/xmlenc#sha256"/>
-                <DigestValue>2qc3zxxGmdrPoGB2Ept6DqzymvirST/HLK615CUOdrg=</DigestValue>
-              </xd:CertDigest>
-              <xd:IssuerSerial>
-                <X509IssuerName>CN=CA phục vụ cho dịch vụ phần mềm G2, O=Ban Cơ yếu Chính phủ, C=VN</X509IssuerName>
-                <X509SerialNumber>8447564535889931591</X509SerialNumber>
-              </xd:IssuerSerial>
-            </xd:Cert>
-          </xd:SigningCertificate>
-          <xd:SignaturePolicyIdentifier>
-            <xd:SignaturePolicyImplied/>
-          </xd:SignaturePolicyIdentifier>
-        </xd:SignedSignatureProperties>
-      </xd:SignedProperties>
-      <xd:UnsignedProperties>
-        <xd:UnsignedSignatureProperties>
-          <xd:CertificateValues>
-            <xd:EncapsulatedX509Certificate>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</xd:EncapsulatedX509Certificate>
-            <xd:EncapsulatedX509Certificate>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</xd:EncapsulatedX509Certificate>
-          </xd:CertificateValues>
-        </xd:UnsignedSignatureProperties>
-      </xd:UnsignedProperties>
-    </xd:QualifyingProperties>
-  </Object>
-</Signature>
 </file>
</xml_diff>